<commit_message>
Finalize presentation and course records
</commit_message>
<xml_diff>
--- a/deliverables/北京交通大学计算机与信息技术学院实习实训日志-杨大松-24281118.docx
+++ b/deliverables/北京交通大学计算机与信息技术学院实习实训日志-杨大松-24281118.docx
@@ -4,17 +4,34 @@
   <w:body>
     <w:p>
       <w:pPr>
+        <w:spacing w:after="120"/>
         <w:jc w:val="center"/>
       </w:pPr>
       <w:r>
         <w:rPr>
           <w:rFonts w:ascii="Microsoft YaHei" w:hAnsi="Microsoft YaHei" w:eastAsia="Microsoft YaHei"/>
           <w:b/>
+          <w:color w:val="202124"/>
           <w:sz w:val="32"/>
         </w:rPr>
-        <w:t>北京交通大学计算机与信息技术学院实习实训日志</w:t>
+        <w:t>北京交通大学计算机与信息技术学院</w:t>
         <w:br/>
-        <w:t>杨大松（24281118）</w:t>
+        <w:t>实习实训日志</w:t>
+      </w:r>
+    </w:p>
+    <w:p>
+      <w:pPr>
+        <w:spacing w:after="280"/>
+        <w:jc w:val="center"/>
+      </w:pPr>
+      <w:r>
+        <w:rPr>
+          <w:rFonts w:ascii="Microsoft YaHei" w:hAnsi="Microsoft YaHei" w:eastAsia="Microsoft YaHei"/>
+          <w:b w:val="0"/>
+          <w:color w:val="5F6368"/>
+          <w:sz w:val="21"/>
+        </w:rPr>
+        <w:t>杨大松（24281118）  |  组员  |  2026-07-10 至 2026-07-19</w:t>
       </w:r>
     </w:p>
     <w:tbl>
@@ -32,8 +49,8 @@
       <w:tr>
         <w:tc>
           <w:tcPr>
-            <w:tcW w:type="dxa" w:w="1440"/>
-            <w:shd w:fill="DBEAFE"/>
+            <w:tcW w:type="dxa" w:w="1512"/>
+            <w:shd w:fill="F1F3F4"/>
             <w:vAlign w:val="center"/>
           </w:tcPr>
           <w:p>
@@ -45,8 +62,8 @@
               <w:rPr>
                 <w:rFonts w:ascii="Microsoft YaHei" w:hAnsi="Microsoft YaHei" w:eastAsia="Microsoft YaHei"/>
                 <w:b/>
-                <w:color w:val="1E40AF"/>
-                <w:sz w:val="18"/>
+                <w:color w:val="202124"/>
+                <w:sz w:val="19"/>
               </w:rPr>
               <w:t>日期</w:t>
             </w:r>
@@ -54,8 +71,8 @@
         </w:tc>
         <w:tc>
           <w:tcPr>
-            <w:tcW w:type="dxa" w:w="6624"/>
-            <w:shd w:fill="DBEAFE"/>
+            <w:tcW w:type="dxa" w:w="6696"/>
+            <w:shd w:fill="F1F3F4"/>
             <w:vAlign w:val="center"/>
           </w:tcPr>
           <w:p>
@@ -67,8 +84,8 @@
               <w:rPr>
                 <w:rFonts w:ascii="Microsoft YaHei" w:hAnsi="Microsoft YaHei" w:eastAsia="Microsoft YaHei"/>
                 <w:b/>
-                <w:color w:val="1E40AF"/>
-                <w:sz w:val="18"/>
+                <w:color w:val="202124"/>
+                <w:sz w:val="19"/>
               </w:rPr>
               <w:t>工作内容</w:t>
             </w:r>
@@ -76,8 +93,8 @@
         </w:tc>
         <w:tc>
           <w:tcPr>
-            <w:tcW w:type="dxa" w:w="1440"/>
-            <w:shd w:fill="DBEAFE"/>
+            <w:tcW w:type="dxa" w:w="1296"/>
+            <w:shd w:fill="F1F3F4"/>
             <w:vAlign w:val="center"/>
           </w:tcPr>
           <w:p>
@@ -89,8 +106,8 @@
               <w:rPr>
                 <w:rFonts w:ascii="Microsoft YaHei" w:hAnsi="Microsoft YaHei" w:eastAsia="Microsoft YaHei"/>
                 <w:b/>
-                <w:color w:val="1E40AF"/>
-                <w:sz w:val="18"/>
+                <w:color w:val="202124"/>
+                <w:sz w:val="19"/>
               </w:rPr>
               <w:t>完成情况</w:t>
             </w:r>
@@ -100,7 +117,7 @@
       <w:tr>
         <w:tc>
           <w:tcPr>
-            <w:tcW w:type="dxa" w:w="1440"/>
+            <w:tcW w:type="dxa" w:w="1512"/>
             <w:vAlign w:val="center"/>
           </w:tcPr>
           <w:p>
@@ -112,7 +129,8 @@
               <w:rPr>
                 <w:rFonts w:ascii="Microsoft YaHei" w:hAnsi="Microsoft YaHei" w:eastAsia="Microsoft YaHei"/>
                 <w:b w:val="0"/>
-                <w:sz w:val="17"/>
+                <w:color w:val="202124"/>
+                <w:sz w:val="18"/>
               </w:rPr>
               <w:t>2026-07-10</w:t>
             </w:r>
@@ -120,7 +138,7 @@
         </w:tc>
         <w:tc>
           <w:tcPr>
-            <w:tcW w:type="dxa" w:w="6624"/>
+            <w:tcW w:type="dxa" w:w="6696"/>
             <w:vAlign w:val="center"/>
           </w:tcPr>
           <w:p>
@@ -132,15 +150,16 @@
               <w:rPr>
                 <w:rFonts w:ascii="Microsoft YaHei" w:hAnsi="Microsoft YaHei" w:eastAsia="Microsoft YaHei"/>
                 <w:b w:val="0"/>
-                <w:sz w:val="17"/>
+                <w:color w:val="202124"/>
+                <w:sz w:val="18"/>
               </w:rPr>
-              <w:t>参与讨论并配合完成：选题与需求分析。</w:t>
+              <w:t>参与需求讨论，提出识别后返回车辆图片和档案信息的展示方式。</w:t>
             </w:r>
           </w:p>
         </w:tc>
         <w:tc>
           <w:tcPr>
-            <w:tcW w:type="dxa" w:w="1440"/>
+            <w:tcW w:type="dxa" w:w="1296"/>
             <w:vAlign w:val="center"/>
           </w:tcPr>
           <w:p>
@@ -152,7 +171,8 @@
               <w:rPr>
                 <w:rFonts w:ascii="Microsoft YaHei" w:hAnsi="Microsoft YaHei" w:eastAsia="Microsoft YaHei"/>
                 <w:b w:val="0"/>
-                <w:sz w:val="17"/>
+                <w:color w:val="202124"/>
+                <w:sz w:val="18"/>
               </w:rPr>
               <w:t>已完成</w:t>
             </w:r>
@@ -162,7 +182,7 @@
       <w:tr>
         <w:tc>
           <w:tcPr>
-            <w:tcW w:type="dxa" w:w="1440"/>
+            <w:tcW w:type="dxa" w:w="1512"/>
             <w:vAlign w:val="center"/>
           </w:tcPr>
           <w:p>
@@ -174,7 +194,8 @@
               <w:rPr>
                 <w:rFonts w:ascii="Microsoft YaHei" w:hAnsi="Microsoft YaHei" w:eastAsia="Microsoft YaHei"/>
                 <w:b w:val="0"/>
-                <w:sz w:val="17"/>
+                <w:color w:val="202124"/>
+                <w:sz w:val="18"/>
               </w:rPr>
               <w:t>2026-07-11</w:t>
             </w:r>
@@ -182,7 +203,7 @@
         </w:tc>
         <w:tc>
           <w:tcPr>
-            <w:tcW w:type="dxa" w:w="6624"/>
+            <w:tcW w:type="dxa" w:w="6696"/>
             <w:vAlign w:val="center"/>
           </w:tcPr>
           <w:p>
@@ -194,15 +215,16 @@
               <w:rPr>
                 <w:rFonts w:ascii="Microsoft YaHei" w:hAnsi="Microsoft YaHei" w:eastAsia="Microsoft YaHei"/>
                 <w:b w:val="0"/>
-                <w:sz w:val="17"/>
+                <w:color w:val="202124"/>
+                <w:sz w:val="18"/>
               </w:rPr>
-              <w:t>参与讨论并配合完成：数据源调研。</w:t>
+              <w:t>调研 Flask 图片上传和前端结果展示方案，整理接口草案。</w:t>
             </w:r>
           </w:p>
         </w:tc>
         <w:tc>
           <w:tcPr>
-            <w:tcW w:type="dxa" w:w="1440"/>
+            <w:tcW w:type="dxa" w:w="1296"/>
             <w:vAlign w:val="center"/>
           </w:tcPr>
           <w:p>
@@ -214,7 +236,8 @@
               <w:rPr>
                 <w:rFonts w:ascii="Microsoft YaHei" w:hAnsi="Microsoft YaHei" w:eastAsia="Microsoft YaHei"/>
                 <w:b w:val="0"/>
-                <w:sz w:val="17"/>
+                <w:color w:val="202124"/>
+                <w:sz w:val="18"/>
               </w:rPr>
               <w:t>已完成</w:t>
             </w:r>
@@ -224,7 +247,7 @@
       <w:tr>
         <w:tc>
           <w:tcPr>
-            <w:tcW w:type="dxa" w:w="1440"/>
+            <w:tcW w:type="dxa" w:w="1512"/>
             <w:vAlign w:val="center"/>
           </w:tcPr>
           <w:p>
@@ -236,7 +259,8 @@
               <w:rPr>
                 <w:rFonts w:ascii="Microsoft YaHei" w:hAnsi="Microsoft YaHei" w:eastAsia="Microsoft YaHei"/>
                 <w:b w:val="0"/>
-                <w:sz w:val="17"/>
+                <w:color w:val="202124"/>
+                <w:sz w:val="18"/>
               </w:rPr>
               <w:t>2026-07-12</w:t>
             </w:r>
@@ -244,7 +268,7 @@
         </w:tc>
         <w:tc>
           <w:tcPr>
-            <w:tcW w:type="dxa" w:w="6624"/>
+            <w:tcW w:type="dxa" w:w="6696"/>
             <w:vAlign w:val="center"/>
           </w:tcPr>
           <w:p>
@@ -256,15 +280,16 @@
               <w:rPr>
                 <w:rFonts w:ascii="Microsoft YaHei" w:hAnsi="Microsoft YaHei" w:eastAsia="Microsoft YaHei"/>
                 <w:b w:val="0"/>
-                <w:sz w:val="17"/>
+                <w:color w:val="202124"/>
+                <w:sz w:val="18"/>
               </w:rPr>
-              <w:t>参与讨论并配合完成：数据下载与整理。</w:t>
+              <w:t>搭建基础项目目录和静态页面，准备图片上传区域。</w:t>
             </w:r>
           </w:p>
         </w:tc>
         <w:tc>
           <w:tcPr>
-            <w:tcW w:type="dxa" w:w="1440"/>
+            <w:tcW w:type="dxa" w:w="1296"/>
             <w:vAlign w:val="center"/>
           </w:tcPr>
           <w:p>
@@ -276,7 +301,8 @@
               <w:rPr>
                 <w:rFonts w:ascii="Microsoft YaHei" w:hAnsi="Microsoft YaHei" w:eastAsia="Microsoft YaHei"/>
                 <w:b w:val="0"/>
-                <w:sz w:val="17"/>
+                <w:color w:val="202124"/>
+                <w:sz w:val="18"/>
               </w:rPr>
               <w:t>已完成</w:t>
             </w:r>
@@ -286,7 +312,7 @@
       <w:tr>
         <w:tc>
           <w:tcPr>
-            <w:tcW w:type="dxa" w:w="1440"/>
+            <w:tcW w:type="dxa" w:w="1512"/>
             <w:vAlign w:val="center"/>
           </w:tcPr>
           <w:p>
@@ -298,7 +324,8 @@
               <w:rPr>
                 <w:rFonts w:ascii="Microsoft YaHei" w:hAnsi="Microsoft YaHei" w:eastAsia="Microsoft YaHei"/>
                 <w:b w:val="0"/>
-                <w:sz w:val="17"/>
+                <w:color w:val="202124"/>
+                <w:sz w:val="18"/>
               </w:rPr>
               <w:t>2026-07-13</w:t>
             </w:r>
@@ -306,7 +333,7 @@
         </w:tc>
         <w:tc>
           <w:tcPr>
-            <w:tcW w:type="dxa" w:w="6624"/>
+            <w:tcW w:type="dxa" w:w="6696"/>
             <w:vAlign w:val="center"/>
           </w:tcPr>
           <w:p>
@@ -318,15 +345,16 @@
               <w:rPr>
                 <w:rFonts w:ascii="Microsoft YaHei" w:hAnsi="Microsoft YaHei" w:eastAsia="Microsoft YaHei"/>
                 <w:b w:val="0"/>
-                <w:sz w:val="17"/>
+                <w:color w:val="202124"/>
+                <w:sz w:val="18"/>
               </w:rPr>
-              <w:t>参与讨论并配合完成：数据集合并。</w:t>
+              <w:t>实现结果图、车牌裁剪图和车辆图片的文件访问逻辑。</w:t>
             </w:r>
           </w:p>
         </w:tc>
         <w:tc>
           <w:tcPr>
-            <w:tcW w:type="dxa" w:w="1440"/>
+            <w:tcW w:type="dxa" w:w="1296"/>
             <w:vAlign w:val="center"/>
           </w:tcPr>
           <w:p>
@@ -338,7 +366,8 @@
               <w:rPr>
                 <w:rFonts w:ascii="Microsoft YaHei" w:hAnsi="Microsoft YaHei" w:eastAsia="Microsoft YaHei"/>
                 <w:b w:val="0"/>
-                <w:sz w:val="17"/>
+                <w:color w:val="202124"/>
+                <w:sz w:val="18"/>
               </w:rPr>
               <w:t>已完成</w:t>
             </w:r>
@@ -348,7 +377,7 @@
       <w:tr>
         <w:tc>
           <w:tcPr>
-            <w:tcW w:type="dxa" w:w="1440"/>
+            <w:tcW w:type="dxa" w:w="1512"/>
             <w:vAlign w:val="center"/>
           </w:tcPr>
           <w:p>
@@ -360,7 +389,8 @@
               <w:rPr>
                 <w:rFonts w:ascii="Microsoft YaHei" w:hAnsi="Microsoft YaHei" w:eastAsia="Microsoft YaHei"/>
                 <w:b w:val="0"/>
-                <w:sz w:val="17"/>
+                <w:color w:val="202124"/>
+                <w:sz w:val="18"/>
               </w:rPr>
               <w:t>2026-07-14</w:t>
             </w:r>
@@ -368,7 +398,7 @@
         </w:tc>
         <w:tc>
           <w:tcPr>
-            <w:tcW w:type="dxa" w:w="6624"/>
+            <w:tcW w:type="dxa" w:w="6696"/>
             <w:vAlign w:val="center"/>
           </w:tcPr>
           <w:p>
@@ -380,15 +410,16 @@
               <w:rPr>
                 <w:rFonts w:ascii="Microsoft YaHei" w:hAnsi="Microsoft YaHei" w:eastAsia="Microsoft YaHei"/>
                 <w:b w:val="0"/>
-                <w:sz w:val="17"/>
+                <w:color w:val="202124"/>
+                <w:sz w:val="18"/>
               </w:rPr>
-              <w:t>参与讨论并配合完成：模型训练脚本。</w:t>
+              <w:t>配合训练模块确定推理调用方式，准备后端模型加载接口。</w:t>
             </w:r>
           </w:p>
         </w:tc>
         <w:tc>
           <w:tcPr>
-            <w:tcW w:type="dxa" w:w="1440"/>
+            <w:tcW w:type="dxa" w:w="1296"/>
             <w:vAlign w:val="center"/>
           </w:tcPr>
           <w:p>
@@ -400,7 +431,8 @@
               <w:rPr>
                 <w:rFonts w:ascii="Microsoft YaHei" w:hAnsi="Microsoft YaHei" w:eastAsia="Microsoft YaHei"/>
                 <w:b w:val="0"/>
-                <w:sz w:val="17"/>
+                <w:color w:val="202124"/>
+                <w:sz w:val="18"/>
               </w:rPr>
               <w:t>已完成</w:t>
             </w:r>
@@ -410,7 +442,7 @@
       <w:tr>
         <w:tc>
           <w:tcPr>
-            <w:tcW w:type="dxa" w:w="1440"/>
+            <w:tcW w:type="dxa" w:w="1512"/>
             <w:vAlign w:val="center"/>
           </w:tcPr>
           <w:p>
@@ -422,7 +454,8 @@
               <w:rPr>
                 <w:rFonts w:ascii="Microsoft YaHei" w:hAnsi="Microsoft YaHei" w:eastAsia="Microsoft YaHei"/>
                 <w:b w:val="0"/>
-                <w:sz w:val="17"/>
+                <w:color w:val="202124"/>
+                <w:sz w:val="18"/>
               </w:rPr>
               <w:t>2026-07-15</w:t>
             </w:r>
@@ -430,7 +463,7 @@
         </w:tc>
         <w:tc>
           <w:tcPr>
-            <w:tcW w:type="dxa" w:w="6624"/>
+            <w:tcW w:type="dxa" w:w="6696"/>
             <w:vAlign w:val="center"/>
           </w:tcPr>
           <w:p>
@@ -442,15 +475,16 @@
               <w:rPr>
                 <w:rFonts w:ascii="Microsoft YaHei" w:hAnsi="Microsoft YaHei" w:eastAsia="Microsoft YaHei"/>
                 <w:b w:val="0"/>
-                <w:sz w:val="17"/>
+                <w:color w:val="202124"/>
+                <w:sz w:val="18"/>
               </w:rPr>
-              <w:t>参与讨论并配合完成：模型训练与调参。</w:t>
+              <w:t>接入模型权重，完成单张图片推理和 JSON 返回测试。</w:t>
             </w:r>
           </w:p>
         </w:tc>
         <w:tc>
           <w:tcPr>
-            <w:tcW w:type="dxa" w:w="1440"/>
+            <w:tcW w:type="dxa" w:w="1296"/>
             <w:vAlign w:val="center"/>
           </w:tcPr>
           <w:p>
@@ -462,7 +496,8 @@
               <w:rPr>
                 <w:rFonts w:ascii="Microsoft YaHei" w:hAnsi="Microsoft YaHei" w:eastAsia="Microsoft YaHei"/>
                 <w:b w:val="0"/>
-                <w:sz w:val="17"/>
+                <w:color w:val="202124"/>
+                <w:sz w:val="18"/>
               </w:rPr>
               <w:t>已完成</w:t>
             </w:r>
@@ -472,7 +507,7 @@
       <w:tr>
         <w:tc>
           <w:tcPr>
-            <w:tcW w:type="dxa" w:w="1440"/>
+            <w:tcW w:type="dxa" w:w="1512"/>
             <w:vAlign w:val="center"/>
           </w:tcPr>
           <w:p>
@@ -484,7 +519,8 @@
               <w:rPr>
                 <w:rFonts w:ascii="Microsoft YaHei" w:hAnsi="Microsoft YaHei" w:eastAsia="Microsoft YaHei"/>
                 <w:b w:val="0"/>
-                <w:sz w:val="17"/>
+                <w:color w:val="202124"/>
+                <w:sz w:val="18"/>
               </w:rPr>
               <w:t>2026-07-16</w:t>
             </w:r>
@@ -492,7 +528,7 @@
         </w:tc>
         <w:tc>
           <w:tcPr>
-            <w:tcW w:type="dxa" w:w="6624"/>
+            <w:tcW w:type="dxa" w:w="6696"/>
             <w:vAlign w:val="center"/>
           </w:tcPr>
           <w:p>
@@ -504,15 +540,16 @@
               <w:rPr>
                 <w:rFonts w:ascii="Microsoft YaHei" w:hAnsi="Microsoft YaHei" w:eastAsia="Microsoft YaHei"/>
                 <w:b w:val="0"/>
-                <w:sz w:val="17"/>
+                <w:color w:val="202124"/>
+                <w:sz w:val="18"/>
               </w:rPr>
-              <w:t>后端接口联调：Flask 接收图片，调用模型并返回 JSON 结果与裁剪图。</w:t>
+              <w:t>完成 Flask /detect 接口和前后端字段联调。</w:t>
             </w:r>
           </w:p>
         </w:tc>
         <w:tc>
           <w:tcPr>
-            <w:tcW w:type="dxa" w:w="1440"/>
+            <w:tcW w:type="dxa" w:w="1296"/>
             <w:vAlign w:val="center"/>
           </w:tcPr>
           <w:p>
@@ -524,7 +561,8 @@
               <w:rPr>
                 <w:rFonts w:ascii="Microsoft YaHei" w:hAnsi="Microsoft YaHei" w:eastAsia="Microsoft YaHei"/>
                 <w:b w:val="0"/>
-                <w:sz w:val="17"/>
+                <w:color w:val="202124"/>
+                <w:sz w:val="18"/>
               </w:rPr>
               <w:t>已完成</w:t>
             </w:r>
@@ -534,7 +572,7 @@
       <w:tr>
         <w:tc>
           <w:tcPr>
-            <w:tcW w:type="dxa" w:w="1440"/>
+            <w:tcW w:type="dxa" w:w="1512"/>
             <w:vAlign w:val="center"/>
           </w:tcPr>
           <w:p>
@@ -546,7 +584,8 @@
               <w:rPr>
                 <w:rFonts w:ascii="Microsoft YaHei" w:hAnsi="Microsoft YaHei" w:eastAsia="Microsoft YaHei"/>
                 <w:b w:val="0"/>
-                <w:sz w:val="17"/>
+                <w:color w:val="202124"/>
+                <w:sz w:val="18"/>
               </w:rPr>
               <w:t>2026-07-17</w:t>
             </w:r>
@@ -554,7 +593,7 @@
         </w:tc>
         <w:tc>
           <w:tcPr>
-            <w:tcW w:type="dxa" w:w="6624"/>
+            <w:tcW w:type="dxa" w:w="6696"/>
             <w:vAlign w:val="center"/>
           </w:tcPr>
           <w:p>
@@ -566,15 +605,16 @@
               <w:rPr>
                 <w:rFonts w:ascii="Microsoft YaHei" w:hAnsi="Microsoft YaHei" w:eastAsia="Microsoft YaHei"/>
                 <w:b w:val="0"/>
-                <w:sz w:val="17"/>
+                <w:color w:val="202124"/>
+                <w:sz w:val="18"/>
               </w:rPr>
-              <w:t>前端识别页面：完成上传、预览、识别结果、车牌裁剪等基础交互。</w:t>
+              <w:t>完成上传、预览、识别结果和裁剪图展示的前端第一版。</w:t>
             </w:r>
           </w:p>
         </w:tc>
         <w:tc>
           <w:tcPr>
-            <w:tcW w:type="dxa" w:w="1440"/>
+            <w:tcW w:type="dxa" w:w="1296"/>
             <w:vAlign w:val="center"/>
           </w:tcPr>
           <w:p>
@@ -586,7 +626,138 @@
               <w:rPr>
                 <w:rFonts w:ascii="Microsoft YaHei" w:hAnsi="Microsoft YaHei" w:eastAsia="Microsoft YaHei"/>
                 <w:b w:val="0"/>
-                <w:sz w:val="17"/>
+                <w:color w:val="202124"/>
+                <w:sz w:val="18"/>
+              </w:rPr>
+              <w:t>已完成</w:t>
+            </w:r>
+          </w:p>
+        </w:tc>
+      </w:tr>
+      <w:tr>
+        <w:tc>
+          <w:tcPr>
+            <w:tcW w:type="dxa" w:w="1512"/>
+            <w:vAlign w:val="center"/>
+          </w:tcPr>
+          <w:p>
+            <w:pPr>
+              <w:spacing w:after="0"/>
+            </w:pPr>
+            <w:r/>
+            <w:r>
+              <w:rPr>
+                <w:rFonts w:ascii="Microsoft YaHei" w:hAnsi="Microsoft YaHei" w:eastAsia="Microsoft YaHei"/>
+                <w:b w:val="0"/>
+                <w:color w:val="202124"/>
+                <w:sz w:val="18"/>
+              </w:rPr>
+              <w:t>2026-07-18</w:t>
+            </w:r>
+          </w:p>
+        </w:tc>
+        <w:tc>
+          <w:tcPr>
+            <w:tcW w:type="dxa" w:w="6696"/>
+            <w:vAlign w:val="center"/>
+          </w:tcPr>
+          <w:p>
+            <w:pPr>
+              <w:spacing w:after="0"/>
+            </w:pPr>
+            <w:r/>
+            <w:r>
+              <w:rPr>
+                <w:rFonts w:ascii="Microsoft YaHei" w:hAnsi="Microsoft YaHei" w:eastAsia="Microsoft YaHei"/>
+                <w:b w:val="0"/>
+                <w:color w:val="202124"/>
+                <w:sz w:val="18"/>
+              </w:rPr>
+              <w:t>升级为企业车辆管理界面，加入车辆档案和自动找车功能。</w:t>
+            </w:r>
+          </w:p>
+        </w:tc>
+        <w:tc>
+          <w:tcPr>
+            <w:tcW w:type="dxa" w:w="1296"/>
+            <w:vAlign w:val="center"/>
+          </w:tcPr>
+          <w:p>
+            <w:pPr>
+              <w:spacing w:after="0"/>
+            </w:pPr>
+            <w:r/>
+            <w:r>
+              <w:rPr>
+                <w:rFonts w:ascii="Microsoft YaHei" w:hAnsi="Microsoft YaHei" w:eastAsia="Microsoft YaHei"/>
+                <w:b w:val="0"/>
+                <w:color w:val="202124"/>
+                <w:sz w:val="18"/>
+              </w:rPr>
+              <w:t>已完成</w:t>
+            </w:r>
+          </w:p>
+        </w:tc>
+      </w:tr>
+      <w:tr>
+        <w:tc>
+          <w:tcPr>
+            <w:tcW w:type="dxa" w:w="1512"/>
+            <w:vAlign w:val="center"/>
+          </w:tcPr>
+          <w:p>
+            <w:pPr>
+              <w:spacing w:after="0"/>
+            </w:pPr>
+            <w:r/>
+            <w:r>
+              <w:rPr>
+                <w:rFonts w:ascii="Microsoft YaHei" w:hAnsi="Microsoft YaHei" w:eastAsia="Microsoft YaHei"/>
+                <w:b w:val="0"/>
+                <w:color w:val="202124"/>
+                <w:sz w:val="18"/>
+              </w:rPr>
+              <w:t>2026-07-19</w:t>
+            </w:r>
+          </w:p>
+        </w:tc>
+        <w:tc>
+          <w:tcPr>
+            <w:tcW w:type="dxa" w:w="6696"/>
+            <w:vAlign w:val="center"/>
+          </w:tcPr>
+          <w:p>
+            <w:pPr>
+              <w:spacing w:after="0"/>
+            </w:pPr>
+            <w:r/>
+            <w:r>
+              <w:rPr>
+                <w:rFonts w:ascii="Microsoft YaHei" w:hAnsi="Microsoft YaHei" w:eastAsia="Microsoft YaHei"/>
+                <w:b w:val="0"/>
+                <w:color w:val="202124"/>
+                <w:sz w:val="18"/>
+              </w:rPr>
+              <w:t>运行多组样例并整理截图，完善静态演示版和演示材料。</w:t>
+            </w:r>
+          </w:p>
+        </w:tc>
+        <w:tc>
+          <w:tcPr>
+            <w:tcW w:type="dxa" w:w="1296"/>
+            <w:vAlign w:val="center"/>
+          </w:tcPr>
+          <w:p>
+            <w:pPr>
+              <w:spacing w:after="0"/>
+            </w:pPr>
+            <w:r/>
+            <w:r>
+              <w:rPr>
+                <w:rFonts w:ascii="Microsoft YaHei" w:hAnsi="Microsoft YaHei" w:eastAsia="Microsoft YaHei"/>
+                <w:b w:val="0"/>
+                <w:color w:val="202124"/>
+                <w:sz w:val="18"/>
               </w:rPr>
               <w:t>已完成</w:t>
             </w:r>
@@ -594,18 +765,18 @@
         </w:tc>
       </w:tr>
     </w:tbl>
-    <w:p/>
     <w:p>
       <w:pPr>
-        <w:spacing w:line="283" w:lineRule="auto" w:after="120"/>
+        <w:spacing w:before="240" w:line="300" w:lineRule="auto"/>
       </w:pPr>
       <w:r>
         <w:rPr>
           <w:rFonts w:ascii="Microsoft YaHei" w:hAnsi="Microsoft YaHei" w:eastAsia="Microsoft YaHei"/>
           <w:b w:val="0"/>
+          <w:color w:val="202124"/>
           <w:sz w:val="21"/>
         </w:rPr>
-        <w:t>个人总结：本阶段主要承担Flask 后端、前端管理系统、OCR 与车辆档案匹配、运行截图和演示材料。通过本项目，进一步熟悉了视觉 AI 项目从数据、模型到系统展示的完整流程，也理解了课程作业对分工、过程材料和可运行成果的要求。</w:t>
+        <w:t>个人总结：本阶段主要承担Flask 后端、管理系统前端、OCR 与车辆档案匹配、运行截图和演示材料。通过连续 10 天的开发和协作，进一步熟悉了视觉 AI 项目从数据、模型到后端接口、前端展示和课程材料整理的完整过程。</w:t>
       </w:r>
     </w:p>
     <w:sectPr>
@@ -1045,11 +1216,11 @@
       <w:outlineLvl w:val="0"/>
     </w:pPr>
     <w:rPr>
-      <w:rFonts w:asciiTheme="majorHAnsi" w:eastAsiaTheme="majorEastAsia" w:hAnsiTheme="majorHAnsi" w:cstheme="majorBidi" w:ascii="Microsoft YaHei" w:hAnsi="Microsoft YaHei" w:eastAsia="Microsoft YaHei"/>
+      <w:rFonts w:asciiTheme="majorHAnsi" w:eastAsiaTheme="majorEastAsia" w:hAnsiTheme="majorHAnsi" w:cstheme="majorBidi"/>
       <w:b/>
       <w:bCs/>
-      <w:color w:val="1E40AF"/>
-      <w:sz w:val="32"/>
+      <w:color w:val="365F91" w:themeColor="accent1" w:themeShade="BF"/>
+      <w:sz w:val="28"/>
       <w:szCs w:val="28"/>
     </w:rPr>
   </w:style>
@@ -1069,10 +1240,10 @@
       <w:outlineLvl w:val="1"/>
     </w:pPr>
     <w:rPr>
-      <w:rFonts w:asciiTheme="majorHAnsi" w:eastAsiaTheme="majorEastAsia" w:hAnsiTheme="majorHAnsi" w:cstheme="majorBidi" w:ascii="Microsoft YaHei" w:hAnsi="Microsoft YaHei" w:eastAsia="Microsoft YaHei"/>
+      <w:rFonts w:asciiTheme="majorHAnsi" w:eastAsiaTheme="majorEastAsia" w:hAnsiTheme="majorHAnsi" w:cstheme="majorBidi"/>
       <w:b/>
       <w:bCs/>
-      <w:color w:val="0F172A"/>
+      <w:color w:val="4F81BD" w:themeColor="accent1"/>
       <w:sz w:val="26"/>
       <w:szCs w:val="26"/>
     </w:rPr>
@@ -1093,11 +1264,10 @@
       <w:outlineLvl w:val="2"/>
     </w:pPr>
     <w:rPr>
-      <w:rFonts w:asciiTheme="majorHAnsi" w:eastAsiaTheme="majorEastAsia" w:hAnsiTheme="majorHAnsi" w:cstheme="majorBidi" w:ascii="Microsoft YaHei" w:hAnsi="Microsoft YaHei" w:eastAsia="Microsoft YaHei"/>
+      <w:rFonts w:asciiTheme="majorHAnsi" w:eastAsiaTheme="majorEastAsia" w:hAnsiTheme="majorHAnsi" w:cstheme="majorBidi"/>
       <w:b/>
       <w:bCs/>
-      <w:color w:val="0F172A"/>
-      <w:sz w:val="22"/>
+      <w:color w:val="4F81BD" w:themeColor="accent1"/>
     </w:rPr>
   </w:style>
   <w:style w:type="paragraph" w:styleId="Heading4">

</xml_diff>